<commit_message>
made fixes and clarification in notebook
</commit_message>
<xml_diff>
--- a/project1/attachments/INF264 Project 1- Implementing and Evaluating Decision Trees.docx
+++ b/project1/attachments/INF264 Project 1- Implementing and Evaluating Decision Trees.docx
@@ -1042,7 +1042,7 @@
           <w:lang w:val="nb-NO"/>
         </w:rPr>
       </w:pPr>
-      <w:hyperlink r:id="rId7" w:history="1">
+      <w:hyperlink r:id="rId7" w:anchor="outline-of-the-permutation-importance-algorithm" w:history="1">
         <w:r>
           <w:rPr>
             <w:rStyle w:val="Hyperlink"/>
@@ -1084,52 +1084,30 @@
           <w:szCs w:val="24"/>
           <w:lang w:val="nb-NO"/>
         </w:rPr>
-        <w:t>sklearn-siden om permutation importance: denne har du et naturlig sted for. I Methods under permutation importance kan du skrive «vi fulgte algoritmebeskrivelsen i [1]». Oppgaven ber dere selv følge den, så den fortjener en referanse i teksten</w:t>
-      </w:r>
-      <w:r>
-        <w:rPr>
-          <w:rFonts w:ascii="Times New Roman" w:hAnsi="Times New Roman" w:cs="Times New Roman"/>
-          <w:b/>
-          <w:bCs/>
-          <w:sz w:val="24"/>
-          <w:szCs w:val="24"/>
-          <w:lang w:val="nb-NO"/>
-        </w:rPr>
-        <w:t xml:space="preserve"> </w:t>
-      </w:r>
-    </w:p>
-    <w:p>
-      <w:pPr>
-        <w:rPr>
-          <w:rFonts w:ascii="Times New Roman" w:hAnsi="Times New Roman" w:cs="Times New Roman"/>
-          <w:b/>
-          <w:bCs/>
-          <w:sz w:val="24"/>
-          <w:szCs w:val="24"/>
-          <w:lang w:val="nb-NO"/>
-        </w:rPr>
-      </w:pPr>
-      <w:r>
-        <w:rPr>
-          <w:rFonts w:ascii="Times New Roman" w:hAnsi="Times New Roman" w:cs="Times New Roman"/>
-          <w:b/>
-          <w:bCs/>
-          <w:sz w:val="24"/>
-          <w:szCs w:val="24"/>
-          <w:lang w:val="nb-NO"/>
-        </w:rPr>
-        <w:t>matplotlib barh-siden: du kan nevne den kort der du beskriver figuren («søylediagrammet er laget med matplotlib [2]»). Alternativt kan den stå som ren kilde nederst. Det er greit, siden den bare er en verktøydokumentasjon.</w:t>
-      </w:r>
-      <w:r>
-        <w:rPr>
-          <w:rFonts w:ascii="Times New Roman" w:hAnsi="Times New Roman" w:cs="Times New Roman"/>
-          <w:b/>
-          <w:bCs/>
-          <w:sz w:val="24"/>
-          <w:szCs w:val="24"/>
-          <w:lang w:val="nb-NO"/>
-        </w:rPr>
-        <w:t xml:space="preserve"> </w:t>
+        <w:t xml:space="preserve">sklearn-siden om permutation importance: denne har du et naturlig sted for. I Methods under permutation importance kan du skrive «vi fulgte algoritmebeskrivelsen i [1]». Oppgaven ber dere selv følge den, så den fortjener en referanse i teksten </w:t>
+      </w:r>
+    </w:p>
+    <w:p>
+      <w:pPr>
+        <w:rPr>
+          <w:rFonts w:ascii="Times New Roman" w:hAnsi="Times New Roman" w:cs="Times New Roman"/>
+          <w:b/>
+          <w:bCs/>
+          <w:sz w:val="24"/>
+          <w:szCs w:val="24"/>
+          <w:lang w:val="nb-NO"/>
+        </w:rPr>
+      </w:pPr>
+      <w:r>
+        <w:rPr>
+          <w:rFonts w:ascii="Times New Roman" w:hAnsi="Times New Roman" w:cs="Times New Roman"/>
+          <w:b/>
+          <w:bCs/>
+          <w:sz w:val="24"/>
+          <w:szCs w:val="24"/>
+          <w:lang w:val="nb-NO"/>
+        </w:rPr>
+        <w:t xml:space="preserve">matplotlib barh-siden: du kan nevne den kort der du beskriver figuren («søylediagrammet er laget med matplotlib [2]»). Alternativt kan den stå som ren kilde nederst. Det er greit, siden den bare er en verktøydokumentasjon. </w:t>
       </w:r>
       <w:r>
         <w:rPr>
@@ -2874,6 +2852,7 @@
       <w:r>
         <w:rPr>
           <w:rFonts w:ascii="Times New Roman" w:hAnsi="Times New Roman" w:cs="Times New Roman"/>
+          <w:noProof/>
           <w:sz w:val="24"/>
           <w:szCs w:val="24"/>
           <w:lang w:val="nb-NO"/>
@@ -3926,6 +3905,7 @@
   <w:style w:type="character" w:default="1" w:styleId="DefaultParagraphFont">
     <w:name w:val="Default Paragraph Font"/>
     <w:uiPriority w:val="1"/>
+    <w:semiHidden/>
     <w:unhideWhenUsed/>
   </w:style>
   <w:style w:type="table" w:default="1" w:styleId="TableNormal">

</xml_diff>